<commit_message>
v troparia fix interim sync
</commit_message>
<xml_diff>
--- a/flow/20230914_vu_template/01-Октоїх-new/Глас_1/1-ВТ-.docx
+++ b/flow/20230914_vu_template/01-Октоїх-new/Глас_1/1-ВТ-.docx
@@ -4915,7 +4915,23 @@
           <w:sz w:val="24"/>
           <w:u w:val="single"/>
         </w:rPr>
-        <w:t>[Господи, Боже наш! Згадай нас грішних і недостойних слуг твоїх, коли призиваємо святе ім'я твоє, і не осороми нас, коли очікуємо милости твоєї, але вислухай, Господи, усі наші спасенні прохання, і вчини нас достойними любити і боятися тебе від усього серця нашого і творити в усьому волю твою.]</w:t>
+        <w:t>[</w:t>
+      </w:r>
+      <w:r>
+        <w:rPr>
+          <w:rFonts w:ascii="Times New Roman" w:hAnsi="Times New Roman"/>
+          <w:sz w:val="24"/>
+          <w:u w:val="single"/>
+        </w:rPr>
+        <w:t>Господи, Боже наш! Згадай нас грішних і недостойних слуг Твоїх, коли призиваємо святе ім'я Твоє, і не осороми нас, коли очікуємо милости Твоєї, але вислухай, Господи, усі наші спасенні прохання, і вчини нас достойними любити і боятися Тебе від усього серця нашого і творити в усьому волю Твою</w:t>
+      </w:r>
+      <w:r>
+        <w:rPr>
+          <w:rFonts w:ascii="Times New Roman" w:hAnsi="Times New Roman"/>
+          <w:sz w:val="24"/>
+          <w:u w:val="single"/>
+        </w:rPr>
+        <w:t>.]</w:t>
       </w:r>
     </w:p>
     <w:p>
@@ -5215,16 +5231,6 @@
     </w:p>
     <w:p>
       <w:pPr>
-        <w:spacing w:after="120"/>
-      </w:pPr>
-      <w:r>
-        <w:rPr>
-          <w:rFonts w:ascii="Times New Roman" w:hAnsi="Times New Roman"/>
-        </w:rPr>
-      </w:r>
-    </w:p>
-    <w:p>
-      <w:pPr>
         <w:pStyle w:val="Heading1"/>
         <w:spacing w:after="120"/>
         <w:jc w:val="center"/>
@@ -6946,7 +6952,15 @@
           <w:color w:val="000000"/>
           <w:sz w:val="24"/>
         </w:rPr>
-        <w:t>, Господи, Боже наш, що підняв нас із постелі нашої і вклав в уста наші слово хвали, щоб поклонятися і призивати ім'я Твоє святе. Ми умоляємо Твоє милосердя, яке Ти завжди виявляв у нашому житті. Пошли поміч свою людям, що стоять перед лицем святої слави Твоєї і дожидають від Тебе багатої милости; і дай нам, що зо страхом і любов'ю завжди Тобі служимо, хвалити несказанну Твою доброту. Бо Тобі належить усяка слава, честь і поклоніння: Отцю, і Сину, і Святому Духові, нині і повсякчас, і на віки віків. Амінь.</w:t>
+        <w:t xml:space="preserve">, Господи, Боже наш, що підняв нас із постелі нашої і вклав в уста наші слово хвали, щоб поклонятися і призивати ім'я Твоє святе. Ми умоляємо Твоє милосердя, яке Ти завжди виявляв у нашому житті. Пошли поміч свою людям, що стоять перед лицем святої </w:t>
+      </w:r>
+      <w:r>
+        <w:rPr>
+          <w:rFonts w:ascii="Times New Roman" w:hAnsi="Times New Roman"/>
+          <w:color w:val="000000"/>
+          <w:sz w:val="24"/>
+        </w:rPr>
+        <w:t>слави Твоєї і дожидають від Тебе багатої милости; і дай нам, що зо страхом і любов'ю завжди Тобі служимо, хвалити несказанну Твою доброту. Бо Тобі належить усяка слава, честь і поклоніння: Отцю, і Сину, і Святому Духові, нині і повсякчас, і на віки віків. Амінь.</w:t>
       </w:r>
     </w:p>
     <w:p>
@@ -6990,7 +7004,21 @@
           <w:color w:val="000000"/>
           <w:sz w:val="24"/>
         </w:rPr>
-        <w:t xml:space="preserve"> Від ночі лине дух наш до Тебе, Боже, бо світлом є повеління Твої. Навчи нас, Боже, правди Твоєї, заповідей Твоїх і виправдань Твоїх. Просвіти наші духовні очі, щоб ми не заснули в гріхах на смерть. Віджени всяку мряку від сердець наших, даруй нам сонце правди і охорони життя наше знаменням і печаттю Святого Твого Духа. Направ стопи наші на шлях мирний, </w:t>
+        <w:t xml:space="preserve"> Від ночі лине дух наш до Тебе, Боже, бо світлом є повеління Твої. Навчи нас, Боже, правди Твоєї, заповідей Твоїх і виправдань Твоїх. Просвіти наші духовні очі, щоб ми не заснули в гріхах на смерть. Віджени всяку мряку від сердець наших, даруй нам сонце правди і охорони життя наше знаменням і печаттю Святого Твого Духа. Направ стопи наші на шлях мирний, дай нам бачити ранішній день у радості, щоб ми Тобі засилали ранішні молитви, бо Твоє є володіння і Твоє є царство і сила, і слава Отця, і Сина, і Святого Духа, нині і повсякчас, і на віки віків. Амінь.</w:t>
+      </w:r>
+    </w:p>
+    <w:p>
+      <w:pPr>
+        <w:spacing w:after="120"/>
+        <w:jc w:val="both"/>
+      </w:pPr>
+      <w:r>
+        <w:rPr>
+          <w:rFonts w:ascii="Times New Roman" w:hAnsi="Times New Roman"/>
+          <w:color w:val="FF0000"/>
+          <w:sz w:val="24"/>
+        </w:rPr>
+        <w:t>4.</w:t>
       </w:r>
       <w:r>
         <w:rPr>
@@ -6998,7 +7026,52 @@
           <w:color w:val="000000"/>
           <w:sz w:val="24"/>
         </w:rPr>
-        <w:t>дай нам бачити ранішній день у радості, щоб ми Тобі засилали ранішні молитви, бо Твоє є володіння і Твоє є царство і сила, і слава Отця, і Сина, і Святого Духа, нині і повсякчас, і на віки віків. Амінь.</w:t>
+        <w:t xml:space="preserve"> Владико, Боже святий і неосяжний, що казав із темряви світлові засіяти, що заспокоїв нас у нічному сні й підвів до величання і моління Твоєї доброти! Ти, що даєш себе умолити задля свого милосердя, прийми і нині нас, що поклоняємося Тобі й по силі </w:t>
+      </w:r>
+      <w:r>
+        <w:rPr>
+          <w:rFonts w:ascii="Times New Roman" w:hAnsi="Times New Roman"/>
+          <w:sz w:val="24"/>
+        </w:rPr>
+        <w:t xml:space="preserve">благодаримо </w:t>
+      </w:r>
+      <w:r>
+        <w:rPr>
+          <w:rFonts w:ascii="Times New Roman" w:hAnsi="Times New Roman"/>
+          <w:color w:val="000000"/>
+          <w:sz w:val="24"/>
+        </w:rPr>
+        <w:t>Т</w:t>
+      </w:r>
+      <w:r>
+        <w:rPr>
+          <w:rFonts w:ascii="Times New Roman" w:hAnsi="Times New Roman"/>
+          <w:sz w:val="24"/>
+        </w:rPr>
+        <w:t>ебе</w:t>
+      </w:r>
+      <w:r>
+        <w:rPr>
+          <w:rFonts w:ascii="Times New Roman" w:hAnsi="Times New Roman"/>
+          <w:color w:val="000000"/>
+          <w:sz w:val="24"/>
+        </w:rPr>
+        <w:t xml:space="preserve">; і даруй нам те, чого просимо задля спасіння. Вчини нас синами світла і дня та спадкоємцями вічних Твоїх </w:t>
+      </w:r>
+      <w:r>
+        <w:rPr>
+          <w:rFonts w:ascii="Times New Roman" w:hAnsi="Times New Roman"/>
+          <w:sz w:val="24"/>
+        </w:rPr>
+        <w:t>благ</w:t>
+      </w:r>
+      <w:r>
+        <w:rPr>
+          <w:rFonts w:ascii="Times New Roman" w:hAnsi="Times New Roman"/>
+          <w:color w:val="000000"/>
+          <w:sz w:val="24"/>
+        </w:rPr>
+        <w:t>. Пом'яни, Господи, за багатством ласк Твоїх усіх людей, що є і моляться з нами, і всю братію нашу на землі й на морі, і на всякому місці володіння Твого, що потребують Твоєї любови й помочі. Усім вияви велику Твою милість, щоб спасенні, як душею так і тілом, завжди перебували й відважно славили чудне й благословенне ім'я Твоє, бо Ти Бог милости і ласк, і любови, і Тобі славу возсилаємо: Отцю, і Сину, і Святому Духові, нині і повсякчас, і на віки віків. Амінь.</w:t>
       </w:r>
     </w:p>
     <w:p>
@@ -7012,7 +7085,7 @@
           <w:color w:val="FF0000"/>
           <w:sz w:val="24"/>
         </w:rPr>
-        <w:t>4.</w:t>
+        <w:t>5.</w:t>
       </w:r>
       <w:r>
         <w:rPr>
@@ -7020,14 +7093,14 @@
           <w:color w:val="000000"/>
           <w:sz w:val="24"/>
         </w:rPr>
-        <w:t xml:space="preserve"> Владико, Боже святий і неосяжний, що казав із темряви світлові засіяти, що заспокоїв нас у нічному сні й підвів до величання і моління Твоєї доброти! Ти, що даєш себе умолити задля свого милосердя, прийми і нині нас, що поклоняємося Тобі й по силі </w:t>
-      </w:r>
-      <w:r>
-        <w:rPr>
-          <w:rFonts w:ascii="Times New Roman" w:hAnsi="Times New Roman"/>
-          <w:sz w:val="24"/>
-        </w:rPr>
-        <w:t xml:space="preserve">благодаримо </w:t>
+        <w:t xml:space="preserve"> Скарб</w:t>
+      </w:r>
+      <w:r>
+        <w:rPr>
+          <w:rFonts w:ascii="Times New Roman" w:hAnsi="Times New Roman"/>
+          <w:sz w:val="24"/>
+        </w:rPr>
+        <w:t>нице</w:t>
       </w:r>
       <w:r>
         <w:rPr>
@@ -7035,14 +7108,14 @@
           <w:color w:val="000000"/>
           <w:sz w:val="24"/>
         </w:rPr>
-        <w:t>Т</w:t>
-      </w:r>
-      <w:r>
-        <w:rPr>
-          <w:rFonts w:ascii="Times New Roman" w:hAnsi="Times New Roman"/>
-          <w:sz w:val="24"/>
-        </w:rPr>
-        <w:t>ебе</w:t>
+        <w:t xml:space="preserve"> </w:t>
+      </w:r>
+      <w:r>
+        <w:rPr>
+          <w:rFonts w:ascii="Times New Roman" w:hAnsi="Times New Roman"/>
+          <w:sz w:val="24"/>
+        </w:rPr>
+        <w:t>благ</w:t>
       </w:r>
       <w:r>
         <w:rPr>
@@ -7050,14 +7123,28 @@
           <w:color w:val="000000"/>
           <w:sz w:val="24"/>
         </w:rPr>
-        <w:t xml:space="preserve">; і даруй нам те, чого просимо задля спасіння. Вчини нас синами світла і дня та спадкоємцями вічних Твоїх </w:t>
-      </w:r>
-      <w:r>
-        <w:rPr>
-          <w:rFonts w:ascii="Times New Roman" w:hAnsi="Times New Roman"/>
-          <w:sz w:val="24"/>
-        </w:rPr>
-        <w:t>благ</w:t>
+        <w:t>, джерело невисихаюче, Отче святий, чудотворче всесильний і вседержителю! Усі Тобі поклоняємося і Тобі молимося та Твої милості і Твої ласки призиваємо на поміч і на заступництво нашій смиренності. Пом'яни, Господи, слуг Твоїх, прийми від усіх нас ранішні моління, як кадило перед Тобою; ні одного з нас не вчини нездатним, але всіх нас зберігай ласками Твоїми. Пом'яни, Господи, тих, що чувають і співають на славу Твою і єдинородного Твого Сина і Бога нашого, і Святого Твого Духа. Будь їм помічником і заступником; прийми їх молитви на наднебесний і духовний Твій жертовник, бо Ти Бог наш, і Тобі славу возсилаємо: Отцю, і Сину, і Святому Духові, нині і повсякчас, і на віки віків. Амінь.</w:t>
+      </w:r>
+    </w:p>
+    <w:p>
+      <w:pPr>
+        <w:spacing w:after="120"/>
+        <w:jc w:val="both"/>
+      </w:pPr>
+      <w:r>
+        <w:rPr>
+          <w:rFonts w:ascii="Times New Roman" w:hAnsi="Times New Roman"/>
+          <w:color w:val="FF0000"/>
+          <w:sz w:val="24"/>
+        </w:rPr>
+        <w:t xml:space="preserve">6. </w:t>
+      </w:r>
+      <w:r>
+        <w:rPr>
+          <w:rFonts w:ascii="Times New Roman" w:hAnsi="Times New Roman"/>
+          <w:sz w:val="24"/>
+        </w:rPr>
+        <w:t>Благодаримо</w:t>
       </w:r>
       <w:r>
         <w:rPr>
@@ -7065,7 +7152,37 @@
           <w:color w:val="000000"/>
           <w:sz w:val="24"/>
         </w:rPr>
-        <w:t>. Пом'яни, Господи, за багатством ласк Твоїх усіх людей, що є і моляться з нами, і всю братію нашу на землі й на морі, і на всякому місці володіння Твого, що потребують Твоєї любови й помочі. Усім вияви велику Твою милість, щоб спасенні, як душею так і тілом, завжди перебували й відважно славили чудне й благословенне ім'я Твоє, бо Ти Бог милости і ласк, і любови, і Тобі славу возсилаємо: Отцю, і Сину, і Святому Духові, нині і повсякчас, і на віки віків. Амінь.</w:t>
+        <w:t xml:space="preserve"> Т</w:t>
+      </w:r>
+      <w:r>
+        <w:rPr>
+          <w:rFonts w:ascii="Times New Roman" w:hAnsi="Times New Roman"/>
+          <w:sz w:val="24"/>
+        </w:rPr>
+        <w:t>е</w:t>
+      </w:r>
+      <w:r>
+        <w:rPr>
+          <w:rFonts w:ascii="Times New Roman" w:hAnsi="Times New Roman"/>
+          <w:color w:val="000000"/>
+          <w:sz w:val="24"/>
+        </w:rPr>
+        <w:t>б</w:t>
+      </w:r>
+      <w:r>
+        <w:rPr>
+          <w:rFonts w:ascii="Times New Roman" w:hAnsi="Times New Roman"/>
+          <w:sz w:val="24"/>
+        </w:rPr>
+        <w:t>е</w:t>
+      </w:r>
+      <w:r>
+        <w:rPr>
+          <w:rFonts w:ascii="Times New Roman" w:hAnsi="Times New Roman"/>
+          <w:color w:val="000000"/>
+          <w:sz w:val="24"/>
+        </w:rPr>
+        <w:t>, Господи, Боже спасіння нашого, бо Ти все робиш для добра життя нашого, щоб ми завжди на Тебе споглядали, Спасителю й Доброчинцю душ наших. Бо Ти дав спокій нам у час минулої ночі й підвів нас, щоб ми поклонялися величному імені Твоєму. Тому молимо Тебе, Господи: Дай нам ласку й силу, щоб ми стали гідними співати Тобі розумно й молитися безупинно та в страсі і тремтінні над нашим спасінням працювали, при заступництві Христа Твого. Пом'яни, Господи, і тих, що вночі до Тебе кличуть. Вислухай їх і помилуй, і круши під ноги їх невидимих і войовничих ворогів. Бо Ти Цар миру і Спас душ наших, і Тобі славу возсилаємо: Отцю і Сину, і Святому Духові, нині і повсякчас, і на віки віків. Амінь.</w:t>
       </w:r>
     </w:p>
     <w:p>
@@ -7079,7 +7196,7 @@
           <w:color w:val="FF0000"/>
           <w:sz w:val="24"/>
         </w:rPr>
-        <w:t>5.</w:t>
+        <w:t>7.</w:t>
       </w:r>
       <w:r>
         <w:rPr>
@@ -7087,14 +7204,7 @@
           <w:color w:val="000000"/>
           <w:sz w:val="24"/>
         </w:rPr>
-        <w:t xml:space="preserve"> Скарб</w:t>
-      </w:r>
-      <w:r>
-        <w:rPr>
-          <w:rFonts w:ascii="Times New Roman" w:hAnsi="Times New Roman"/>
-          <w:sz w:val="24"/>
-        </w:rPr>
-        <w:t>нице</w:t>
+        <w:t xml:space="preserve"> Боже й Отче Господа нашого Ісуса Христа! Ти підніс нас з постелі нашої і зібрав на годину молитви. Дай нам ласку відкрити уста наші і прийми наші подяки, що в наших силах, і навчи нас установ Твоїх. Бо молитися як слід не вміємо, якщо Ти, Господи, святим Твоїм Духом не навчиш нас. Тому молимося Тобі: Даруй і прости, якщо ми згрішили аж до теперішньої години </w:t>
       </w:r>
       <w:r>
         <w:rPr>
@@ -7102,14 +7212,21 @@
           <w:color w:val="000000"/>
           <w:sz w:val="24"/>
         </w:rPr>
-        <w:t xml:space="preserve"> </w:t>
-      </w:r>
-      <w:r>
-        <w:rPr>
-          <w:rFonts w:ascii="Times New Roman" w:hAnsi="Times New Roman"/>
-          <w:sz w:val="24"/>
-        </w:rPr>
-        <w:t>благ</w:t>
+        <w:t>словом або ділом, або думкою, добровільно або недобровільно. Бо коли на провини будеш дивитися, Господи, Господи, то хто встоїться, бо в Тебе є прощення. Ти один святий, допоміжник сильний, захисник життя нашого, і Тебе ми завжди оспівуватимемо. Нехай буде сила Царства Твого завжди благословенна і вельми прославлювана: Отця, і Сина, і Святого Духа, нині і повсякчас, і на віки віків. Амінь.</w:t>
+      </w:r>
+    </w:p>
+    <w:p>
+      <w:pPr>
+        <w:spacing w:after="120"/>
+        <w:jc w:val="both"/>
+      </w:pPr>
+      <w:r>
+        <w:rPr>
+          <w:rFonts w:ascii="Times New Roman" w:hAnsi="Times New Roman"/>
+          <w:color w:val="FF0000"/>
+          <w:sz w:val="24"/>
+        </w:rPr>
+        <w:t xml:space="preserve">8. </w:t>
       </w:r>
       <w:r>
         <w:rPr>
@@ -7117,7 +7234,7 @@
           <w:color w:val="000000"/>
           <w:sz w:val="24"/>
         </w:rPr>
-        <w:t>, джерело невисихаюче, Отче святий, чудотворче всесильний і вседержителю! Усі Тобі поклоняємося і Тобі молимося та Твої милості і Твої ласки призиваємо на поміч і на заступництво нашій смиренності. Пом'яни, Господи, слуг Твоїх, прийми від усіх нас ранішні моління, як кадило перед Тобою; ні одного з нас не вчини нездатним, але всіх нас зберігай ласками Твоїми. Пом'яни, Господи, тих, що чувають і співають на славу Твою і єдинородного Твого Сина і Бога нашого, і Святого Твого Духа. Будь їм помічником і заступником; прийми їх молитви на наднебесний і духовний Твій жертовник, бо Ти Бог наш, і Тобі славу возсилаємо: Отцю, і Сину, і Святому Духові, нині і повсякчас, і на віки віків. Амінь.</w:t>
+        <w:t>Господи, Боже наш, що сонну неміч забрав від нас і покликав нас візванням святим, щоб і вночі підносити руки наші і прославляти Тебе за справедливі Твої присуди. Прийми благання наші, моління, визнавання, нічні служби і даруй нам, Боже, віру бездоганну, надію впевнену, любов нелицемірну. Благослови наші входи й виходи, вчинки, слова, діла й думки; і дай нам дочекатися початку дня, нам, що хвалять й оспівують, і благословлять добрість Твоєї несказанної сили, щоб було благословенне Твоє пресвяте ім'я і прославлене Твоє царство: Отця, і Сина, і Святого Духа, нині і повсякчас, і на віки віків. Амінь.</w:t>
       </w:r>
     </w:p>
     <w:p>
@@ -7131,14 +7248,7 @@
           <w:color w:val="FF0000"/>
           <w:sz w:val="24"/>
         </w:rPr>
-        <w:t xml:space="preserve">6. </w:t>
-      </w:r>
-      <w:r>
-        <w:rPr>
-          <w:rFonts w:ascii="Times New Roman" w:hAnsi="Times New Roman"/>
-          <w:sz w:val="24"/>
-        </w:rPr>
-        <w:t>Благодаримо</w:t>
+        <w:t>9.</w:t>
       </w:r>
       <w:r>
         <w:rPr>
@@ -7146,111 +7256,7 @@
           <w:color w:val="000000"/>
           <w:sz w:val="24"/>
         </w:rPr>
-        <w:t xml:space="preserve"> Т</w:t>
-      </w:r>
-      <w:r>
-        <w:rPr>
-          <w:rFonts w:ascii="Times New Roman" w:hAnsi="Times New Roman"/>
-          <w:sz w:val="24"/>
-        </w:rPr>
-        <w:t>е</w:t>
-      </w:r>
-      <w:r>
-        <w:rPr>
-          <w:rFonts w:ascii="Times New Roman" w:hAnsi="Times New Roman"/>
-          <w:color w:val="000000"/>
-          <w:sz w:val="24"/>
-        </w:rPr>
-        <w:t>б</w:t>
-      </w:r>
-      <w:r>
-        <w:rPr>
-          <w:rFonts w:ascii="Times New Roman" w:hAnsi="Times New Roman"/>
-          <w:sz w:val="24"/>
-        </w:rPr>
-        <w:t>е</w:t>
-      </w:r>
-      <w:r>
-        <w:rPr>
-          <w:rFonts w:ascii="Times New Roman" w:hAnsi="Times New Roman"/>
-          <w:color w:val="000000"/>
-          <w:sz w:val="24"/>
-        </w:rPr>
-        <w:t>, Господи, Боже спасіння нашого, бо Ти все робиш для добра життя нашого, щоб ми завжди на Тебе споглядали, Спасителю й Доброчинцю душ наших. Бо Ти дав спокій нам у час минулої ночі й підвів нас, щоб ми поклонялися величному імені Твоєму. Тому молимо Тебе, Господи: Дай нам ласку й силу, щоб ми стали гідними співати Тобі розумно й молитися безупинно та в страсі і тремтінні над нашим спасінням працювали, при заступництві Христа Твого. Пом'яни, Господи, і тих, що вночі до Тебе кличуть. Вислухай їх і помилуй, і круши під ноги їх невидимих і войовничих ворогів. Бо Ти Цар миру і Спас душ наших, і Тобі славу возсилаємо: Отцю і Сину, і Святому Духові, нині і повсякчас, і на віки віків. Амінь.</w:t>
-      </w:r>
-    </w:p>
-    <w:p>
-      <w:pPr>
-        <w:spacing w:after="120"/>
-        <w:jc w:val="both"/>
-      </w:pPr>
-      <w:r>
-        <w:rPr>
-          <w:rFonts w:ascii="Times New Roman" w:hAnsi="Times New Roman"/>
-          <w:color w:val="FF0000"/>
-          <w:sz w:val="24"/>
-        </w:rPr>
-        <w:t>7.</w:t>
-      </w:r>
-      <w:r>
-        <w:rPr>
-          <w:rFonts w:ascii="Times New Roman" w:hAnsi="Times New Roman"/>
-          <w:color w:val="000000"/>
-          <w:sz w:val="24"/>
-        </w:rPr>
-        <w:t xml:space="preserve"> Боже й Отче Господа нашого Ісуса Христа! Ти підніс нас з постелі нашої і зібрав на годину молитви. Дай нам ласку відкрити уста наші і прийми наші подяки, що в наших силах, і навчи нас установ Твоїх. Бо молитися як слід не вміємо, якщо Ти, Господи, святим Твоїм Духом не навчиш нас. Тому молимося Тобі: Даруй і прости, якщо ми згрішили аж до теперішньої години словом або ділом, або думкою, добровільно або недобровільно. Бо коли на провини будеш дивитися, Господи, Господи, то хто встоїться, бо в Тебе є прощення. Ти один святий, допоміжник сильний, захисник життя нашого, і Тебе ми завжди оспівуватимемо. Нехай буде сила Царства Твого завжди благословенна і вельми прославлювана: Отця, і Сина, і Святого Духа, нині і повсякчас, і на віки віків. Амінь.</w:t>
-      </w:r>
-    </w:p>
-    <w:p>
-      <w:pPr>
-        <w:spacing w:after="120"/>
-        <w:jc w:val="both"/>
-      </w:pPr>
-      <w:r>
-        <w:rPr>
-          <w:rFonts w:ascii="Times New Roman" w:hAnsi="Times New Roman"/>
-          <w:color w:val="FF0000"/>
-          <w:sz w:val="24"/>
-        </w:rPr>
-        <w:t xml:space="preserve">8. </w:t>
-      </w:r>
-      <w:r>
-        <w:rPr>
-          <w:rFonts w:ascii="Times New Roman" w:hAnsi="Times New Roman"/>
-          <w:color w:val="000000"/>
-          <w:sz w:val="24"/>
-        </w:rPr>
-        <w:t>Господи, Боже наш, що сонну неміч забрав від нас і покликав нас візванням святим, щоб і вночі підносити руки наші і прославляти Тебе за справедливі Твої присуди. Прийми благання наші, моління, визнавання, нічні служби і даруй нам, Боже, віру бездоганну, надію впевнену, любов нелицемірну. Благослови наші входи й виходи, вчинки, слова, діла й думки; і дай нам дочекатися початку дня, нам, що хвалять й оспівують, і благословлять добрість Твоєї несказанної сили, щоб було благословенне Твоє пресвяте ім'я і прославлене Твоє царство: Отця, і Сина, і Святого Духа, нині і повсякчас, і на віки віків. Амінь.</w:t>
-      </w:r>
-    </w:p>
-    <w:p>
-      <w:pPr>
-        <w:spacing w:after="120"/>
-        <w:jc w:val="both"/>
-      </w:pPr>
-      <w:r>
-        <w:rPr>
-          <w:rFonts w:ascii="Times New Roman" w:hAnsi="Times New Roman"/>
-          <w:color w:val="FF0000"/>
-          <w:sz w:val="24"/>
-        </w:rPr>
-        <w:t>9.</w:t>
-      </w:r>
-      <w:r>
-        <w:rPr>
-          <w:rFonts w:ascii="Times New Roman" w:hAnsi="Times New Roman"/>
-          <w:color w:val="000000"/>
-          <w:sz w:val="24"/>
-        </w:rPr>
-        <w:t xml:space="preserve"> Господи, Боже наш! Ти за покаяння дарував людям відпущення, нам же, як образ пізнання і визнання гріхів, показав покаяння і прощення пророка Давида. Тож, Владико, помилуй з </w:t>
-      </w:r>
-      <w:r>
-        <w:rPr>
-          <w:rFonts w:ascii="Times New Roman" w:hAnsi="Times New Roman"/>
-          <w:color w:val="000000"/>
-          <w:sz w:val="24"/>
-        </w:rPr>
-        <w:t>великої милости Твоєї нас, що в чимало великих гріхів впали, і по багатстві ласк Твоїх очисти беззаконня наші, бо перед Тобою згрішили ми, Господи, що невідомі й таємні речі серця людського знаєш, і єдиний Ти маєш владу прощати гріхи. Серце ж чисте вчини в нас і Духом владичним утверди нас, і радість спасіння Твого яви нам. Не відкинь нас від лиця Твого, але дозволь, як благий і людинолюбний, аж до останнього нашого віддиху появляти Тобі жертву справедливости й приноси на святих Твоїх жертовниках, милістю і ласками і людинолюб'ям єдинородного Сина Твого, з яким Ти є благословенний з пресвятим, добрим і животворчим Твоїм Духом, нині й повсякчас, і на віки віків. Амінь.</w:t>
+        <w:t xml:space="preserve"> Господи, Боже наш! Ти за покаяння дарував людям відпущення, нам же, як образ пізнання і визнання гріхів, показав покаяння і прощення пророка Давида. Тож, Владико, помилуй з великої милости Твоєї нас, що в чимало великих гріхів впали, і по багатстві ласк Твоїх очисти беззаконня наші, бо перед Тобою згрішили ми, Господи, що невідомі й таємні речі серця людського знаєш, і єдиний Ти маєш владу прощати гріхи. Серце ж чисте вчини в нас і Духом владичним утверди нас, і радість спасіння Твого яви нам. Не відкинь нас від лиця Твого, але дозволь, як благий і людинолюбний, аж до останнього нашого віддиху появляти Тобі жертву справедливости й приноси на святих Твоїх жертовниках, милістю і ласками і людинолюб'ям єдинородного Сина Твого, з яким Ти є благословенний з пресвятим, добрим і животворчим Твоїм Духом, нині й повсякчас, і на віки віків. Амінь.</w:t>
       </w:r>
     </w:p>
     <w:p>

</xml_diff>

<commit_message>
fixed triple litany, fixed templates
</commit_message>
<xml_diff>
--- a/flow/20230914_vu_template/01-Октоїх-new/Глас_1/1-ВТ-.docx
+++ b/flow/20230914_vu_template/01-Октоїх-new/Глас_1/1-ВТ-.docx
@@ -4605,14 +4605,268 @@
     <w:p>
       <w:pPr>
         <w:spacing w:after="120"/>
+      </w:pPr>
+      <w:r>
+        <w:rPr>
+          <w:rFonts w:ascii="Times New Roman" w:hAnsi="Times New Roman"/>
+          <w:sz w:val="24"/>
+        </w:rPr>
+        <w:t>Помилуй нас, Боже, з великої милості Твоєї, молимось Тобі, вислухай і помилуй.</w:t>
+      </w:r>
+    </w:p>
+    <w:p>
+      <w:pPr>
+        <w:spacing w:after="120"/>
+      </w:pPr>
+      <w:r>
+        <w:rPr>
+          <w:rFonts w:ascii="Times New Roman" w:hAnsi="Times New Roman"/>
+          <w:i/>
+          <w:color w:val="FF4400"/>
+          <w:sz w:val="24"/>
+        </w:rPr>
+        <w:t>Вірні:</w:t>
+      </w:r>
+      <w:r>
+        <w:rPr>
+          <w:rFonts w:ascii="Times New Roman" w:hAnsi="Times New Roman"/>
+          <w:sz w:val="24"/>
+        </w:rPr>
+        <w:t xml:space="preserve"> Го́споди, поми́луй. </w:t>
+      </w:r>
+      <w:r>
+        <w:rPr>
+          <w:rFonts w:ascii="Times New Roman" w:hAnsi="Times New Roman"/>
+          <w:i/>
+          <w:color w:val="FF4400"/>
+          <w:sz w:val="24"/>
+        </w:rPr>
+        <w:t>(3 р.)</w:t>
+      </w:r>
+    </w:p>
+    <w:p>
+      <w:pPr>
+        <w:spacing w:after="120"/>
+      </w:pPr>
+      <w:r>
+        <w:rPr>
+          <w:rFonts w:ascii="Times New Roman" w:hAnsi="Times New Roman"/>
+          <w:sz w:val="24"/>
+        </w:rPr>
+        <w:t xml:space="preserve">Ще молимось за святішого вселенського архиєрея Франциска, папу Римського, і за блаженнішого патріярха нашого Святослава, і за преосвященнішого архиєпископа і митрополита нашого кир </w:t>
+      </w:r>
+      <w:r>
+        <w:rPr>
+          <w:rFonts w:ascii="Times New Roman" w:hAnsi="Times New Roman"/>
+          <w:i/>
+          <w:color w:val="FF4400"/>
+          <w:sz w:val="24"/>
+        </w:rPr>
+        <w:t>ім’я</w:t>
+      </w:r>
+      <w:r>
+        <w:rPr>
+          <w:rFonts w:ascii="Times New Roman" w:hAnsi="Times New Roman"/>
+          <w:i/>
+          <w:sz w:val="24"/>
+        </w:rPr>
+        <w:t>,</w:t>
+      </w:r>
+      <w:r>
+        <w:rPr>
+          <w:rFonts w:ascii="Times New Roman" w:hAnsi="Times New Roman"/>
+          <w:sz w:val="24"/>
+        </w:rPr>
+        <w:t xml:space="preserve"> і за боголюбивого єпископа нашого кир </w:t>
+      </w:r>
+      <w:r>
+        <w:rPr>
+          <w:rFonts w:ascii="Times New Roman" w:hAnsi="Times New Roman"/>
+          <w:i/>
+          <w:color w:val="FF4400"/>
+          <w:sz w:val="24"/>
+        </w:rPr>
+        <w:t>ім’я</w:t>
+      </w:r>
+      <w:r>
+        <w:rPr>
+          <w:rFonts w:ascii="Times New Roman" w:hAnsi="Times New Roman"/>
+          <w:i/>
+          <w:sz w:val="24"/>
+        </w:rPr>
+        <w:t>,</w:t>
+      </w:r>
+      <w:r>
+        <w:rPr>
+          <w:rFonts w:ascii="Times New Roman" w:hAnsi="Times New Roman"/>
+          <w:sz w:val="24"/>
+        </w:rPr>
+        <w:t xml:space="preserve"> за тих, що служать і послужили у святім храмі цьому, і за отців наших духовних, і всіх у Христі братів і сестер наших.</w:t>
+      </w:r>
+    </w:p>
+    <w:p>
+      <w:pPr>
+        <w:spacing w:after="120"/>
+      </w:pPr>
+      <w:r>
+        <w:rPr>
+          <w:rFonts w:ascii="Times New Roman" w:hAnsi="Times New Roman"/>
+          <w:i/>
+          <w:color w:val="FF4400"/>
+          <w:sz w:val="24"/>
+        </w:rPr>
+        <w:t>Вірні:</w:t>
+      </w:r>
+      <w:r>
+        <w:rPr>
+          <w:rFonts w:ascii="Times New Roman" w:hAnsi="Times New Roman"/>
+          <w:sz w:val="24"/>
+        </w:rPr>
+        <w:t xml:space="preserve"> Го́споди, поми́луй. </w:t>
+      </w:r>
+      <w:r>
+        <w:rPr>
+          <w:rFonts w:ascii="Times New Roman" w:hAnsi="Times New Roman"/>
+          <w:i/>
+          <w:color w:val="FF4400"/>
+          <w:sz w:val="24"/>
+        </w:rPr>
+        <w:t>(3 р.)</w:t>
+      </w:r>
+    </w:p>
+    <w:p>
+      <w:pPr>
+        <w:spacing w:after="120"/>
+      </w:pPr>
+      <w:r>
+        <w:rPr>
+          <w:rFonts w:ascii="Times New Roman" w:hAnsi="Times New Roman"/>
+          <w:sz w:val="24"/>
+        </w:rPr>
+        <w:t>Ще молимось за Богом бережений народ наш, за правління і за все військо.</w:t>
+      </w:r>
+    </w:p>
+    <w:p>
+      <w:pPr>
+        <w:spacing w:after="120"/>
+      </w:pPr>
+      <w:r>
+        <w:rPr>
+          <w:rFonts w:ascii="Times New Roman" w:hAnsi="Times New Roman"/>
+          <w:i/>
+          <w:color w:val="FF4400"/>
+          <w:sz w:val="24"/>
+        </w:rPr>
+        <w:t>Вірні:</w:t>
+      </w:r>
+      <w:r>
+        <w:rPr>
+          <w:rFonts w:ascii="Times New Roman" w:hAnsi="Times New Roman"/>
+          <w:sz w:val="24"/>
+        </w:rPr>
+        <w:t xml:space="preserve"> Го́споди, поми́луй. </w:t>
+      </w:r>
+      <w:r>
+        <w:rPr>
+          <w:rFonts w:ascii="Times New Roman" w:hAnsi="Times New Roman"/>
+          <w:i/>
+          <w:color w:val="FF4400"/>
+          <w:sz w:val="24"/>
+        </w:rPr>
+        <w:t>(3 р.)</w:t>
+      </w:r>
+    </w:p>
+    <w:p>
+      <w:pPr>
+        <w:spacing w:after="120"/>
+      </w:pPr>
+      <w:r>
+        <w:rPr>
+          <w:rFonts w:ascii="Times New Roman" w:hAnsi="Times New Roman"/>
+          <w:sz w:val="24"/>
+        </w:rPr>
+        <w:t>Ще молимось за тут присутніх людей, що очікують від Тебе великої і багатої милости, за тих, що творять нам милостиню, і за всіх православних християн.</w:t>
+      </w:r>
+    </w:p>
+    <w:p>
+      <w:pPr>
+        <w:spacing w:after="120"/>
+      </w:pPr>
+      <w:r>
+        <w:rPr>
+          <w:rFonts w:ascii="Times New Roman" w:hAnsi="Times New Roman"/>
+          <w:i/>
+          <w:color w:val="FF4400"/>
+          <w:sz w:val="24"/>
+        </w:rPr>
+        <w:t>Вірні:</w:t>
+      </w:r>
+      <w:r>
+        <w:rPr>
+          <w:rFonts w:ascii="Times New Roman" w:hAnsi="Times New Roman"/>
+          <w:sz w:val="24"/>
+        </w:rPr>
+        <w:t xml:space="preserve"> Го́споди, поми́луй. </w:t>
+      </w:r>
+      <w:r>
+        <w:rPr>
+          <w:rFonts w:ascii="Times New Roman" w:hAnsi="Times New Roman"/>
+          <w:i/>
+          <w:color w:val="FF4400"/>
+          <w:sz w:val="24"/>
+        </w:rPr>
+        <w:t>(3 р.)</w:t>
+      </w:r>
+    </w:p>
+    <w:p>
+      <w:pPr>
+        <w:spacing w:after="120"/>
         <w:jc w:val="both"/>
       </w:pPr>
       <w:r>
         <w:rPr>
           <w:rFonts w:ascii="Times New Roman" w:hAnsi="Times New Roman"/>
           <w:sz w:val="24"/>
-        </w:rPr>
-        <w:t>Промовмо всі з усієї душі і з усієї мислі нашої, промовмо.</w:t>
+          <w:u w:val="single"/>
+        </w:rPr>
+        <w:t>[</w:t>
+      </w:r>
+      <w:r>
+        <w:rPr>
+          <w:rFonts w:ascii="Times New Roman" w:hAnsi="Times New Roman"/>
+          <w:sz w:val="24"/>
+          <w:u w:val="single"/>
+        </w:rPr>
+        <w:t>Господи, Боже наш! Згадай нас грішних і недостойних слуг Твоїх, коли призиваємо святе ім'я Твоє, і не осороми нас, коли очікуємо милости Твоєї, але вислухай, Господи, усі наші спасенні прохання, і вчини нас достойними любити і боятися Тебе від усього серця нашого і творити в усьому волю Твою</w:t>
+      </w:r>
+      <w:r>
+        <w:rPr>
+          <w:rFonts w:ascii="Times New Roman" w:hAnsi="Times New Roman"/>
+          <w:sz w:val="24"/>
+          <w:u w:val="single"/>
+        </w:rPr>
+        <w:t>.]</w:t>
+      </w:r>
+    </w:p>
+    <w:p>
+      <w:pPr>
+        <w:spacing w:after="120"/>
+      </w:pPr>
+      <w:r>
+        <w:rPr>
+          <w:rFonts w:ascii="Times New Roman" w:hAnsi="Times New Roman"/>
+          <w:i/>
+          <w:color w:val="FF4400"/>
+          <w:sz w:val="24"/>
+        </w:rPr>
+        <w:t>Священник:</w:t>
+      </w:r>
+      <w:r>
+        <w:rPr>
+          <w:rFonts w:ascii="Times New Roman" w:hAnsi="Times New Roman"/>
+          <w:sz w:val="24"/>
+        </w:rPr>
+        <w:t xml:space="preserve"> Бо милостивий і людинолюбний Бог єси, і Тобі славу возсилаємо, Отцю, і Сину, і Святому Духові, нині, і повсякчас, і на віки віків.</w:t>
       </w:r>
     </w:p>
     <w:p>
@@ -4632,350 +4886,15 @@
       <w:r>
         <w:rPr>
           <w:rFonts w:ascii="Times New Roman" w:hAnsi="Times New Roman"/>
-          <w:color w:val="FF0000"/>
-          <w:sz w:val="24"/>
-        </w:rPr>
-        <w:t xml:space="preserve"> </w:t>
-      </w:r>
-      <w:r>
-        <w:rPr>
-          <w:rFonts w:ascii="Times New Roman" w:hAnsi="Times New Roman"/>
-          <w:sz w:val="24"/>
-        </w:rPr>
-        <w:t>Господи, помилуй.</w:t>
-      </w:r>
-    </w:p>
-    <w:p>
-      <w:pPr>
-        <w:spacing w:after="120"/>
-        <w:jc w:val="both"/>
-      </w:pPr>
-      <w:r>
-        <w:rPr>
-          <w:rFonts w:ascii="Times New Roman" w:hAnsi="Times New Roman"/>
-          <w:sz w:val="24"/>
-        </w:rPr>
-        <w:t>Господи, Вседержителю, Боже отців наших, молимось тобі, вислухай і помилуй.</w:t>
-      </w:r>
-    </w:p>
-    <w:p>
-      <w:pPr>
-        <w:spacing w:after="120"/>
-        <w:jc w:val="both"/>
-      </w:pPr>
-      <w:r>
-        <w:rPr>
-          <w:rFonts w:ascii="Times New Roman" w:hAnsi="Times New Roman"/>
-          <w:i/>
-          <w:color w:val="FF0000"/>
-          <w:sz w:val="24"/>
-        </w:rPr>
-        <w:t>Вірні:</w:t>
-      </w:r>
-      <w:r>
-        <w:rPr>
-          <w:rFonts w:ascii="Times New Roman" w:hAnsi="Times New Roman"/>
-          <w:color w:val="FF0000"/>
-          <w:sz w:val="24"/>
-        </w:rPr>
-        <w:t xml:space="preserve"> </w:t>
-      </w:r>
-      <w:r>
-        <w:rPr>
-          <w:rFonts w:ascii="Times New Roman" w:hAnsi="Times New Roman"/>
-          <w:sz w:val="24"/>
-        </w:rPr>
-        <w:t>Господи, помилуй.</w:t>
-      </w:r>
-    </w:p>
-    <w:p>
-      <w:pPr>
-        <w:spacing w:after="120"/>
-      </w:pPr>
-      <w:r>
-        <w:rPr>
-          <w:rFonts w:ascii="Times New Roman" w:hAnsi="Times New Roman"/>
-          <w:sz w:val="24"/>
-        </w:rPr>
-        <w:t>Помилуй нас, Боже, з великої милості Твоєї, молимось Тобі, вислухай і помилуй.</w:t>
-      </w:r>
-    </w:p>
-    <w:p>
-      <w:pPr>
-        <w:spacing w:after="120"/>
-      </w:pPr>
-      <w:r>
-        <w:rPr>
-          <w:rFonts w:ascii="Times New Roman" w:hAnsi="Times New Roman"/>
-          <w:i/>
-          <w:color w:val="FF4400"/>
-          <w:sz w:val="24"/>
-        </w:rPr>
-        <w:t>Вірні:</w:t>
-      </w:r>
-      <w:r>
-        <w:rPr>
-          <w:rFonts w:ascii="Times New Roman" w:hAnsi="Times New Roman"/>
-          <w:sz w:val="24"/>
-        </w:rPr>
-        <w:t xml:space="preserve"> Го́споди, поми́луй. </w:t>
-      </w:r>
-      <w:r>
-        <w:rPr>
-          <w:rFonts w:ascii="Times New Roman" w:hAnsi="Times New Roman"/>
-          <w:i/>
-          <w:color w:val="FF4400"/>
-          <w:sz w:val="24"/>
-        </w:rPr>
-        <w:t>(3 р.)</w:t>
-      </w:r>
-    </w:p>
-    <w:p>
-      <w:pPr>
-        <w:spacing w:after="120"/>
-      </w:pPr>
-      <w:r>
-        <w:rPr>
-          <w:rFonts w:ascii="Times New Roman" w:hAnsi="Times New Roman"/>
-          <w:sz w:val="24"/>
-        </w:rPr>
-        <w:t xml:space="preserve">Ще молимось за святішого вселенського архиєрея Франциска, папу Римського, і за блаженнішого патріярха нашого Святослава, і за преосвященнішого архиєпископа і митрополита нашого кир </w:t>
-      </w:r>
-      <w:r>
-        <w:rPr>
-          <w:rFonts w:ascii="Times New Roman" w:hAnsi="Times New Roman"/>
-          <w:i/>
-          <w:color w:val="FF4400"/>
-          <w:sz w:val="24"/>
-        </w:rPr>
-        <w:t>ім’я</w:t>
-      </w:r>
-      <w:r>
-        <w:rPr>
-          <w:rFonts w:ascii="Times New Roman" w:hAnsi="Times New Roman"/>
-          <w:i/>
-          <w:sz w:val="24"/>
-        </w:rPr>
-        <w:t>,</w:t>
-      </w:r>
-      <w:r>
-        <w:rPr>
-          <w:rFonts w:ascii="Times New Roman" w:hAnsi="Times New Roman"/>
-          <w:sz w:val="24"/>
-        </w:rPr>
-        <w:t xml:space="preserve"> і за боголюбивого єпископа нашого кир </w:t>
-      </w:r>
-      <w:r>
-        <w:rPr>
-          <w:rFonts w:ascii="Times New Roman" w:hAnsi="Times New Roman"/>
-          <w:i/>
-          <w:color w:val="FF4400"/>
-          <w:sz w:val="24"/>
-        </w:rPr>
-        <w:t>ім’я</w:t>
-      </w:r>
-      <w:r>
-        <w:rPr>
-          <w:rFonts w:ascii="Times New Roman" w:hAnsi="Times New Roman"/>
-          <w:i/>
-          <w:sz w:val="24"/>
-        </w:rPr>
-        <w:t>,</w:t>
-      </w:r>
-      <w:r>
-        <w:rPr>
-          <w:rFonts w:ascii="Times New Roman" w:hAnsi="Times New Roman"/>
-          <w:sz w:val="24"/>
-        </w:rPr>
-        <w:t xml:space="preserve"> за тих, що служать і послужили у святім храмі цьому, і за отців наших духовних, і всіх у Христі братів і сестер наших.</w:t>
-      </w:r>
-    </w:p>
-    <w:p>
-      <w:pPr>
-        <w:spacing w:after="120"/>
-      </w:pPr>
-      <w:r>
-        <w:rPr>
-          <w:rFonts w:ascii="Times New Roman" w:hAnsi="Times New Roman"/>
-          <w:i/>
-          <w:color w:val="FF4400"/>
-          <w:sz w:val="24"/>
-        </w:rPr>
-        <w:t>Вірні:</w:t>
-      </w:r>
-      <w:r>
-        <w:rPr>
-          <w:rFonts w:ascii="Times New Roman" w:hAnsi="Times New Roman"/>
-          <w:sz w:val="24"/>
-        </w:rPr>
-        <w:t xml:space="preserve"> Го́споди, поми́луй. </w:t>
-      </w:r>
-      <w:r>
-        <w:rPr>
-          <w:rFonts w:ascii="Times New Roman" w:hAnsi="Times New Roman"/>
-          <w:i/>
-          <w:color w:val="FF4400"/>
-          <w:sz w:val="24"/>
-        </w:rPr>
-        <w:t>(3 р.)</w:t>
-      </w:r>
-    </w:p>
-    <w:p>
-      <w:pPr>
-        <w:spacing w:after="120"/>
-      </w:pPr>
-      <w:r>
-        <w:rPr>
-          <w:rFonts w:ascii="Times New Roman" w:hAnsi="Times New Roman"/>
-          <w:sz w:val="24"/>
-        </w:rPr>
-        <w:t>Ще молимось за Богом бережений народ наш, за правління і за все військо.</w:t>
-      </w:r>
-    </w:p>
-    <w:p>
-      <w:pPr>
-        <w:spacing w:after="120"/>
-      </w:pPr>
-      <w:r>
-        <w:rPr>
-          <w:rFonts w:ascii="Times New Roman" w:hAnsi="Times New Roman"/>
-          <w:i/>
-          <w:color w:val="FF4400"/>
-          <w:sz w:val="24"/>
-        </w:rPr>
-        <w:t>Вірні:</w:t>
-      </w:r>
-      <w:r>
-        <w:rPr>
-          <w:rFonts w:ascii="Times New Roman" w:hAnsi="Times New Roman"/>
-          <w:sz w:val="24"/>
-        </w:rPr>
-        <w:t xml:space="preserve"> Го́споди, поми́луй. </w:t>
-      </w:r>
-      <w:r>
-        <w:rPr>
-          <w:rFonts w:ascii="Times New Roman" w:hAnsi="Times New Roman"/>
-          <w:i/>
-          <w:color w:val="FF4400"/>
-          <w:sz w:val="24"/>
-        </w:rPr>
-        <w:t>(3 р.)</w:t>
-      </w:r>
-    </w:p>
-    <w:p>
-      <w:pPr>
-        <w:spacing w:after="120"/>
-      </w:pPr>
-      <w:r>
-        <w:rPr>
-          <w:rFonts w:ascii="Times New Roman" w:hAnsi="Times New Roman"/>
-          <w:sz w:val="24"/>
-        </w:rPr>
-        <w:t>Ще молимось за тут присутніх людей, що очікують від Тебе великої і багатої милости, за тих, що творять нам милостиню, і за всіх православних християн.</w:t>
-      </w:r>
-    </w:p>
-    <w:p>
-      <w:pPr>
-        <w:spacing w:after="120"/>
-      </w:pPr>
-      <w:r>
-        <w:rPr>
-          <w:rFonts w:ascii="Times New Roman" w:hAnsi="Times New Roman"/>
-          <w:i/>
-          <w:color w:val="FF4400"/>
-          <w:sz w:val="24"/>
-        </w:rPr>
-        <w:t>Вірні:</w:t>
-      </w:r>
-      <w:r>
-        <w:rPr>
-          <w:rFonts w:ascii="Times New Roman" w:hAnsi="Times New Roman"/>
-          <w:sz w:val="24"/>
-        </w:rPr>
-        <w:t xml:space="preserve"> Го́споди, поми́луй. </w:t>
-      </w:r>
-      <w:r>
-        <w:rPr>
-          <w:rFonts w:ascii="Times New Roman" w:hAnsi="Times New Roman"/>
-          <w:i/>
-          <w:color w:val="FF4400"/>
-          <w:sz w:val="24"/>
-        </w:rPr>
-        <w:t>(3 р.)</w:t>
-      </w:r>
-    </w:p>
-    <w:p>
-      <w:pPr>
-        <w:spacing w:after="120"/>
-        <w:jc w:val="both"/>
-      </w:pPr>
-      <w:r>
-        <w:rPr>
-          <w:rFonts w:ascii="Times New Roman" w:hAnsi="Times New Roman"/>
-          <w:sz w:val="24"/>
-          <w:u w:val="single"/>
-        </w:rPr>
-        <w:t>[</w:t>
-      </w:r>
-      <w:r>
-        <w:rPr>
-          <w:rFonts w:ascii="Times New Roman" w:hAnsi="Times New Roman"/>
-          <w:sz w:val="24"/>
-          <w:u w:val="single"/>
-        </w:rPr>
-        <w:t>Господи, Боже наш! Згадай нас грішних і недостойних слуг Твоїх, коли призиваємо святе ім'я Твоє, і не осороми нас, коли очікуємо милости Твоєї, але вислухай, Господи, усі наші спасенні прохання, і вчини нас достойними любити і боятися Тебе від усього серця нашого і творити в усьому волю Твою</w:t>
-      </w:r>
-      <w:r>
-        <w:rPr>
-          <w:rFonts w:ascii="Times New Roman" w:hAnsi="Times New Roman"/>
-          <w:sz w:val="24"/>
-          <w:u w:val="single"/>
-        </w:rPr>
-        <w:t>.]</w:t>
-      </w:r>
-    </w:p>
-    <w:p>
-      <w:pPr>
-        <w:spacing w:after="120"/>
-      </w:pPr>
-      <w:r>
-        <w:rPr>
-          <w:rFonts w:ascii="Times New Roman" w:hAnsi="Times New Roman"/>
-          <w:i/>
-          <w:color w:val="FF4400"/>
-          <w:sz w:val="24"/>
-        </w:rPr>
-        <w:t>Священник:</w:t>
-      </w:r>
-      <w:r>
-        <w:rPr>
-          <w:rFonts w:ascii="Times New Roman" w:hAnsi="Times New Roman"/>
-          <w:sz w:val="24"/>
-        </w:rPr>
-        <w:t xml:space="preserve"> Бо милостивий і людинолюбний Бог єси, і Тобі славу возсилаємо, Отцю, і Сину, і Святому Духові, нині, і повсякчас, і на віки віків.</w:t>
-      </w:r>
-    </w:p>
-    <w:p>
-      <w:pPr>
-        <w:spacing w:after="120"/>
-        <w:jc w:val="both"/>
-      </w:pPr>
-      <w:r>
-        <w:rPr>
-          <w:rFonts w:ascii="Times New Roman" w:hAnsi="Times New Roman"/>
-          <w:i/>
-          <w:color w:val="FF0000"/>
-          <w:sz w:val="24"/>
-        </w:rPr>
-        <w:t>Вірні:</w:t>
-      </w:r>
-      <w:r>
-        <w:rPr>
-          <w:rFonts w:ascii="Times New Roman" w:hAnsi="Times New Roman"/>
           <w:sz w:val="24"/>
         </w:rPr>
         <w:t xml:space="preserve"> Амінь.</w:t>
       </w:r>
+    </w:p>
+    <w:p>
+      <w:pPr>
+        <w:spacing w:after="120"/>
+      </w:pPr>
     </w:p>
     <w:p>
       <w:pPr>
@@ -6952,7 +6871,21 @@
           <w:color w:val="000000"/>
           <w:sz w:val="24"/>
         </w:rPr>
-        <w:t xml:space="preserve">, Господи, Боже наш, що підняв нас із постелі нашої і вклав в уста наші слово хвали, щоб поклонятися і призивати ім'я Твоє святе. Ми умоляємо Твоє милосердя, яке Ти завжди виявляв у нашому житті. Пошли поміч свою людям, що стоять перед лицем святої </w:t>
+        <w:t>, Господи, Боже наш, що підняв нас із постелі нашої і вклав в уста наші слово хвали, щоб поклонятися і призивати ім'я Твоє святе. Ми умоляємо Твоє милосердя, яке Ти завжди виявляв у нашому житті. Пошли поміч свою людям, що стоять перед лицем святої слави Твоєї і дожидають від Тебе багатої милости; і дай нам, що зо страхом і любов'ю завжди Тобі служимо, хвалити несказанну Твою доброту. Бо Тобі належить усяка слава, честь і поклоніння: Отцю, і Сину, і Святому Духові, нині і повсякчас, і на віки віків. Амінь.</w:t>
+      </w:r>
+    </w:p>
+    <w:p>
+      <w:pPr>
+        <w:spacing w:after="120"/>
+        <w:jc w:val="both"/>
+      </w:pPr>
+      <w:r>
+        <w:rPr>
+          <w:rFonts w:ascii="Times New Roman" w:hAnsi="Times New Roman"/>
+          <w:color w:val="FF0000"/>
+          <w:sz w:val="24"/>
+        </w:rPr>
+        <w:t xml:space="preserve">2. </w:t>
       </w:r>
       <w:r>
         <w:rPr>
@@ -6960,7 +6893,7 @@
           <w:color w:val="000000"/>
           <w:sz w:val="24"/>
         </w:rPr>
-        <w:t>слави Твоєї і дожидають від Тебе багатої милости; і дай нам, що зо страхом і любов'ю завжди Тобі служимо, хвалити несказанну Твою доброту. Бо Тобі належить усяка слава, честь і поклоніння: Отцю, і Сину, і Святому Духові, нині і повсякчас, і на віки віків. Амінь.</w:t>
+        <w:t>Від ночі лине дух наш до Тебе, Боже, бо світлом є повеління Твої на землі. Навчи нас у страсі Твоєму виконувати правду й добро, бо Тебе славимо як правдивого Бога нашого. Прихили вухо своє і вислухай нас, і пом'яни, Господи, тих, що є та що моляться з нами, всіх по імені, і спаси їх силою Твоєю. Благослови людей Твоїх і освяти спадкоємство Твоє: мир світові Твоєму даруй, церквам Твоїм, Священникам, владі, і всім людям. Хай благословиться і прославляється всечесне і величне ім'я Твоє, Отця, і Сина, і Святого Духа, нині і повсякчас, і на віки віків. Амінь.</w:t>
       </w:r>
     </w:p>
     <w:p>
@@ -6974,7 +6907,7 @@
           <w:color w:val="FF0000"/>
           <w:sz w:val="24"/>
         </w:rPr>
-        <w:t xml:space="preserve">2. </w:t>
+        <w:t>3.</w:t>
       </w:r>
       <w:r>
         <w:rPr>
@@ -6982,7 +6915,7 @@
           <w:color w:val="000000"/>
           <w:sz w:val="24"/>
         </w:rPr>
-        <w:t>Від ночі лине дух наш до Тебе, Боже, бо світлом є повеління Твої на землі. Навчи нас у страсі Твоєму виконувати правду й добро, бо Тебе славимо як правдивого Бога нашого. Прихили вухо своє і вислухай нас, і пом'яни, Господи, тих, що є та що моляться з нами, всіх по імені, і спаси їх силою Твоєю. Благослови людей Твоїх і освяти спадкоємство Твоє: мир світові Твоєму даруй, церквам Твоїм, Священникам, владі, і всім людям. Хай благословиться і прославляється всечесне і величне ім'я Твоє, Отця, і Сина, і Святого Духа, нині і повсякчас, і на віки віків. Амінь.</w:t>
+        <w:t xml:space="preserve"> Від ночі лине дух наш до Тебе, Боже, бо світлом є повеління Твої. Навчи нас, Боже, правди Твоєї, заповідей Твоїх і виправдань Твоїх. Просвіти наші духовні очі, щоб ми не заснули в гріхах на смерть. Віджени всяку мряку від сердець наших, даруй нам сонце правди і охорони життя наше знаменням і печаттю Святого Твого Духа. Направ стопи наші на шлях мирний, дай нам бачити ранішній день у радості, щоб ми Тобі засилали ранішні молитви, бо Твоє є володіння і Твоє є царство і сила, і слава Отця, і Сина, і Святого Духа, нині і повсякчас, і на віки віків. Амінь.</w:t>
       </w:r>
     </w:p>
     <w:p>
@@ -6996,7 +6929,7 @@
           <w:color w:val="FF0000"/>
           <w:sz w:val="24"/>
         </w:rPr>
-        <w:t>3.</w:t>
+        <w:t>4.</w:t>
       </w:r>
       <w:r>
         <w:rPr>
@@ -7004,7 +6937,52 @@
           <w:color w:val="000000"/>
           <w:sz w:val="24"/>
         </w:rPr>
-        <w:t xml:space="preserve"> Від ночі лине дух наш до Тебе, Боже, бо світлом є повеління Твої. Навчи нас, Боже, правди Твоєї, заповідей Твоїх і виправдань Твоїх. Просвіти наші духовні очі, щоб ми не заснули в гріхах на смерть. Віджени всяку мряку від сердець наших, даруй нам сонце правди і охорони життя наше знаменням і печаттю Святого Твого Духа. Направ стопи наші на шлях мирний, дай нам бачити ранішній день у радості, щоб ми Тобі засилали ранішні молитви, бо Твоє є володіння і Твоє є царство і сила, і слава Отця, і Сина, і Святого Духа, нині і повсякчас, і на віки віків. Амінь.</w:t>
+        <w:t xml:space="preserve"> Владико, Боже святий і неосяжний, що казав із темряви світлові засіяти, що заспокоїв нас у нічному сні й підвів до величання і моління Твоєї доброти! Ти, що даєш себе умолити задля свого милосердя, прийми і нині нас, що поклоняємося Тобі й по силі </w:t>
+      </w:r>
+      <w:r>
+        <w:rPr>
+          <w:rFonts w:ascii="Times New Roman" w:hAnsi="Times New Roman"/>
+          <w:sz w:val="24"/>
+        </w:rPr>
+        <w:t xml:space="preserve">благодаримо </w:t>
+      </w:r>
+      <w:r>
+        <w:rPr>
+          <w:rFonts w:ascii="Times New Roman" w:hAnsi="Times New Roman"/>
+          <w:color w:val="000000"/>
+          <w:sz w:val="24"/>
+        </w:rPr>
+        <w:t>Т</w:t>
+      </w:r>
+      <w:r>
+        <w:rPr>
+          <w:rFonts w:ascii="Times New Roman" w:hAnsi="Times New Roman"/>
+          <w:sz w:val="24"/>
+        </w:rPr>
+        <w:t>ебе</w:t>
+      </w:r>
+      <w:r>
+        <w:rPr>
+          <w:rFonts w:ascii="Times New Roman" w:hAnsi="Times New Roman"/>
+          <w:color w:val="000000"/>
+          <w:sz w:val="24"/>
+        </w:rPr>
+        <w:t xml:space="preserve">; і даруй нам те, чого просимо задля спасіння. Вчини нас синами світла і дня та спадкоємцями вічних Твоїх </w:t>
+      </w:r>
+      <w:r>
+        <w:rPr>
+          <w:rFonts w:ascii="Times New Roman" w:hAnsi="Times New Roman"/>
+          <w:sz w:val="24"/>
+        </w:rPr>
+        <w:t>благ</w:t>
+      </w:r>
+      <w:r>
+        <w:rPr>
+          <w:rFonts w:ascii="Times New Roman" w:hAnsi="Times New Roman"/>
+          <w:color w:val="000000"/>
+          <w:sz w:val="24"/>
+        </w:rPr>
+        <w:t>. Пом'яни, Господи, за багатством ласк Твоїх усіх людей, що є і моляться з нами, і всю братію нашу на землі й на морі, і на всякому місці володіння Твого, що потребують Твоєї любови й помочі. Усім вияви велику Твою милість, щоб спасенні, як душею так і тілом, завжди перебували й відважно славили чудне й благословенне ім'я Твоє, бо Ти Бог милости і ласк, і любови, і Тобі славу возсилаємо: Отцю, і Сину, і Святому Духові, нині і повсякчас, і на віки віків. Амінь.</w:t>
       </w:r>
     </w:p>
     <w:p>
@@ -7018,7 +6996,7 @@
           <w:color w:val="FF0000"/>
           <w:sz w:val="24"/>
         </w:rPr>
-        <w:t>4.</w:t>
+        <w:t>5.</w:t>
       </w:r>
       <w:r>
         <w:rPr>
@@ -7026,14 +7004,14 @@
           <w:color w:val="000000"/>
           <w:sz w:val="24"/>
         </w:rPr>
-        <w:t xml:space="preserve"> Владико, Боже святий і неосяжний, що казав із темряви світлові засіяти, що заспокоїв нас у нічному сні й підвів до величання і моління Твоєї доброти! Ти, що даєш себе умолити задля свого милосердя, прийми і нині нас, що поклоняємося Тобі й по силі </w:t>
-      </w:r>
-      <w:r>
-        <w:rPr>
-          <w:rFonts w:ascii="Times New Roman" w:hAnsi="Times New Roman"/>
-          <w:sz w:val="24"/>
-        </w:rPr>
-        <w:t xml:space="preserve">благодаримо </w:t>
+        <w:t xml:space="preserve"> Скарб</w:t>
+      </w:r>
+      <w:r>
+        <w:rPr>
+          <w:rFonts w:ascii="Times New Roman" w:hAnsi="Times New Roman"/>
+          <w:sz w:val="24"/>
+        </w:rPr>
+        <w:t>нице</w:t>
       </w:r>
       <w:r>
         <w:rPr>
@@ -7041,14 +7019,14 @@
           <w:color w:val="000000"/>
           <w:sz w:val="24"/>
         </w:rPr>
-        <w:t>Т</w:t>
-      </w:r>
-      <w:r>
-        <w:rPr>
-          <w:rFonts w:ascii="Times New Roman" w:hAnsi="Times New Roman"/>
-          <w:sz w:val="24"/>
-        </w:rPr>
-        <w:t>ебе</w:t>
+        <w:t xml:space="preserve"> </w:t>
+      </w:r>
+      <w:r>
+        <w:rPr>
+          <w:rFonts w:ascii="Times New Roman" w:hAnsi="Times New Roman"/>
+          <w:sz w:val="24"/>
+        </w:rPr>
+        <w:t>благ</w:t>
       </w:r>
       <w:r>
         <w:rPr>
@@ -7056,14 +7034,28 @@
           <w:color w:val="000000"/>
           <w:sz w:val="24"/>
         </w:rPr>
-        <w:t xml:space="preserve">; і даруй нам те, чого просимо задля спасіння. Вчини нас синами світла і дня та спадкоємцями вічних Твоїх </w:t>
-      </w:r>
-      <w:r>
-        <w:rPr>
-          <w:rFonts w:ascii="Times New Roman" w:hAnsi="Times New Roman"/>
-          <w:sz w:val="24"/>
-        </w:rPr>
-        <w:t>благ</w:t>
+        <w:t>, джерело невисихаюче, Отче святий, чудотворче всесильний і вседержителю! Усі Тобі поклоняємося і Тобі молимося та Твої милості і Твої ласки призиваємо на поміч і на заступництво нашій смиренності. Пом'яни, Господи, слуг Твоїх, прийми від усіх нас ранішні моління, як кадило перед Тобою; ні одного з нас не вчини нездатним, але всіх нас зберігай ласками Твоїми. Пом'яни, Господи, тих, що чувають і співають на славу Твою і єдинородного Твого Сина і Бога нашого, і Святого Твого Духа. Будь їм помічником і заступником; прийми їх молитви на наднебесний і духовний Твій жертовник, бо Ти Бог наш, і Тобі славу возсилаємо: Отцю, і Сину, і Святому Духові, нині і повсякчас, і на віки віків. Амінь.</w:t>
+      </w:r>
+    </w:p>
+    <w:p>
+      <w:pPr>
+        <w:spacing w:after="120"/>
+        <w:jc w:val="both"/>
+      </w:pPr>
+      <w:r>
+        <w:rPr>
+          <w:rFonts w:ascii="Times New Roman" w:hAnsi="Times New Roman"/>
+          <w:color w:val="FF0000"/>
+          <w:sz w:val="24"/>
+        </w:rPr>
+        <w:t xml:space="preserve">6. </w:t>
+      </w:r>
+      <w:r>
+        <w:rPr>
+          <w:rFonts w:ascii="Times New Roman" w:hAnsi="Times New Roman"/>
+          <w:sz w:val="24"/>
+        </w:rPr>
+        <w:t>Благодаримо</w:t>
       </w:r>
       <w:r>
         <w:rPr>
@@ -7071,7 +7063,37 @@
           <w:color w:val="000000"/>
           <w:sz w:val="24"/>
         </w:rPr>
-        <w:t>. Пом'яни, Господи, за багатством ласк Твоїх усіх людей, що є і моляться з нами, і всю братію нашу на землі й на морі, і на всякому місці володіння Твого, що потребують Твоєї любови й помочі. Усім вияви велику Твою милість, щоб спасенні, як душею так і тілом, завжди перебували й відважно славили чудне й благословенне ім'я Твоє, бо Ти Бог милости і ласк, і любови, і Тобі славу возсилаємо: Отцю, і Сину, і Святому Духові, нині і повсякчас, і на віки віків. Амінь.</w:t>
+        <w:t xml:space="preserve"> Т</w:t>
+      </w:r>
+      <w:r>
+        <w:rPr>
+          <w:rFonts w:ascii="Times New Roman" w:hAnsi="Times New Roman"/>
+          <w:sz w:val="24"/>
+        </w:rPr>
+        <w:t>е</w:t>
+      </w:r>
+      <w:r>
+        <w:rPr>
+          <w:rFonts w:ascii="Times New Roman" w:hAnsi="Times New Roman"/>
+          <w:color w:val="000000"/>
+          <w:sz w:val="24"/>
+        </w:rPr>
+        <w:t>б</w:t>
+      </w:r>
+      <w:r>
+        <w:rPr>
+          <w:rFonts w:ascii="Times New Roman" w:hAnsi="Times New Roman"/>
+          <w:sz w:val="24"/>
+        </w:rPr>
+        <w:t>е</w:t>
+      </w:r>
+      <w:r>
+        <w:rPr>
+          <w:rFonts w:ascii="Times New Roman" w:hAnsi="Times New Roman"/>
+          <w:color w:val="000000"/>
+          <w:sz w:val="24"/>
+        </w:rPr>
+        <w:t>, Господи, Боже спасіння нашого, бо Ти все робиш для добра життя нашого, щоб ми завжди на Тебе споглядали, Спасителю й Доброчинцю душ наших. Бо Ти дав спокій нам у час минулої ночі й підвів нас, щоб ми поклонялися величному імені Твоєму. Тому молимо Тебе, Господи: Дай нам ласку й силу, щоб ми стали гідними співати Тобі розумно й молитися безупинно та в страсі і тремтінні над нашим спасінням працювали, при заступництві Христа Твого. Пом'яни, Господи, і тих, що вночі до Тебе кличуть. Вислухай їх і помилуй, і круши під ноги їх невидимих і войовничих ворогів. Бо Ти Цар миру і Спас душ наших, і Тобі славу возсилаємо: Отцю і Сину, і Святому Духові, нині і повсякчас, і на віки віків. Амінь.</w:t>
       </w:r>
     </w:p>
     <w:p>
@@ -7085,7 +7107,7 @@
           <w:color w:val="FF0000"/>
           <w:sz w:val="24"/>
         </w:rPr>
-        <w:t>5.</w:t>
+        <w:t>7.</w:t>
       </w:r>
       <w:r>
         <w:rPr>
@@ -7093,14 +7115,21 @@
           <w:color w:val="000000"/>
           <w:sz w:val="24"/>
         </w:rPr>
-        <w:t xml:space="preserve"> Скарб</w:t>
-      </w:r>
-      <w:r>
-        <w:rPr>
-          <w:rFonts w:ascii="Times New Roman" w:hAnsi="Times New Roman"/>
-          <w:sz w:val="24"/>
-        </w:rPr>
-        <w:t>нице</w:t>
+        <w:t xml:space="preserve"> Боже й Отче Господа нашого Ісуса Христа! Ти підніс нас з постелі нашої і зібрав на годину молитви. Дай нам ласку відкрити уста наші і прийми наші подяки, що в наших силах, і навчи нас установ Твоїх. Бо молитися як слід не вміємо, якщо Ти, Господи, святим Твоїм Духом не навчиш нас. Тому молимося Тобі: Даруй і прости, якщо ми згрішили аж до теперішньої години словом або ділом, або думкою, добровільно або недобровільно. Бо коли на провини будеш дивитися, Господи, Господи, то хто встоїться, бо в Тебе є прощення. Ти один святий, допоміжник сильний, захисник життя нашого, і Тебе ми завжди оспівуватимемо. Нехай буде сила Царства Твого завжди благословенна і вельми прославлювана: Отця, і Сина, і Святого Духа, нині і повсякчас, і на віки віків. Амінь.</w:t>
+      </w:r>
+    </w:p>
+    <w:p>
+      <w:pPr>
+        <w:spacing w:after="120"/>
+        <w:jc w:val="both"/>
+      </w:pPr>
+      <w:r>
+        <w:rPr>
+          <w:rFonts w:ascii="Times New Roman" w:hAnsi="Times New Roman"/>
+          <w:color w:val="FF0000"/>
+          <w:sz w:val="24"/>
+        </w:rPr>
+        <w:t xml:space="preserve">8. </w:t>
       </w:r>
       <w:r>
         <w:rPr>
@@ -7108,14 +7137,21 @@
           <w:color w:val="000000"/>
           <w:sz w:val="24"/>
         </w:rPr>
-        <w:t xml:space="preserve"> </w:t>
-      </w:r>
-      <w:r>
-        <w:rPr>
-          <w:rFonts w:ascii="Times New Roman" w:hAnsi="Times New Roman"/>
-          <w:sz w:val="24"/>
-        </w:rPr>
-        <w:t>благ</w:t>
+        <w:t>Господи, Боже наш, що сонну неміч забрав від нас і покликав нас візванням святим, щоб і вночі підносити руки наші і прославляти Тебе за справедливі Твої присуди. Прийми благання наші, моління, визнавання, нічні служби і даруй нам, Боже, віру бездоганну, надію впевнену, любов нелицемірну. Благослови наші входи й виходи, вчинки, слова, діла й думки; і дай нам дочекатися початку дня, нам, що хвалять й оспівують, і благословлять добрість Твоєї несказанної сили, щоб було благословенне Твоє пресвяте ім'я і прославлене Твоє царство: Отця, і Сина, і Святого Духа, нині і повсякчас, і на віки віків. Амінь.</w:t>
+      </w:r>
+    </w:p>
+    <w:p>
+      <w:pPr>
+        <w:spacing w:after="120"/>
+        <w:jc w:val="both"/>
+      </w:pPr>
+      <w:r>
+        <w:rPr>
+          <w:rFonts w:ascii="Times New Roman" w:hAnsi="Times New Roman"/>
+          <w:color w:val="FF0000"/>
+          <w:sz w:val="24"/>
+        </w:rPr>
+        <w:t>9.</w:t>
       </w:r>
       <w:r>
         <w:rPr>
@@ -7123,28 +7159,7 @@
           <w:color w:val="000000"/>
           <w:sz w:val="24"/>
         </w:rPr>
-        <w:t>, джерело невисихаюче, Отче святий, чудотворче всесильний і вседержителю! Усі Тобі поклоняємося і Тобі молимося та Твої милості і Твої ласки призиваємо на поміч і на заступництво нашій смиренності. Пом'яни, Господи, слуг Твоїх, прийми від усіх нас ранішні моління, як кадило перед Тобою; ні одного з нас не вчини нездатним, але всіх нас зберігай ласками Твоїми. Пом'яни, Господи, тих, що чувають і співають на славу Твою і єдинородного Твого Сина і Бога нашого, і Святого Твого Духа. Будь їм помічником і заступником; прийми їх молитви на наднебесний і духовний Твій жертовник, бо Ти Бог наш, і Тобі славу возсилаємо: Отцю, і Сину, і Святому Духові, нині і повсякчас, і на віки віків. Амінь.</w:t>
-      </w:r>
-    </w:p>
-    <w:p>
-      <w:pPr>
-        <w:spacing w:after="120"/>
-        <w:jc w:val="both"/>
-      </w:pPr>
-      <w:r>
-        <w:rPr>
-          <w:rFonts w:ascii="Times New Roman" w:hAnsi="Times New Roman"/>
-          <w:color w:val="FF0000"/>
-          <w:sz w:val="24"/>
-        </w:rPr>
-        <w:t xml:space="preserve">6. </w:t>
-      </w:r>
-      <w:r>
-        <w:rPr>
-          <w:rFonts w:ascii="Times New Roman" w:hAnsi="Times New Roman"/>
-          <w:sz w:val="24"/>
-        </w:rPr>
-        <w:t>Благодаримо</w:t>
+        <w:t xml:space="preserve"> Господи, Боже наш! Ти за покаяння дарував людям відпущення, нам же, як образ пізнання і визнання гріхів, показав покаяння і прощення пророка Давида. Тож, Владико, помилуй з великої милости Твоєї нас, що в чимало великих гріхів впали, і по багатстві ласк Твоїх очисти беззаконня наші, бо перед Тобою згрішили ми, Господи, що невідомі й таємні речі серця людського знаєш, і єдиний Ти маєш владу прощати гріхи. Серце ж чисте вчини в нас і Духом </w:t>
       </w:r>
       <w:r>
         <w:rPr>
@@ -7152,111 +7167,7 @@
           <w:color w:val="000000"/>
           <w:sz w:val="24"/>
         </w:rPr>
-        <w:t xml:space="preserve"> Т</w:t>
-      </w:r>
-      <w:r>
-        <w:rPr>
-          <w:rFonts w:ascii="Times New Roman" w:hAnsi="Times New Roman"/>
-          <w:sz w:val="24"/>
-        </w:rPr>
-        <w:t>е</w:t>
-      </w:r>
-      <w:r>
-        <w:rPr>
-          <w:rFonts w:ascii="Times New Roman" w:hAnsi="Times New Roman"/>
-          <w:color w:val="000000"/>
-          <w:sz w:val="24"/>
-        </w:rPr>
-        <w:t>б</w:t>
-      </w:r>
-      <w:r>
-        <w:rPr>
-          <w:rFonts w:ascii="Times New Roman" w:hAnsi="Times New Roman"/>
-          <w:sz w:val="24"/>
-        </w:rPr>
-        <w:t>е</w:t>
-      </w:r>
-      <w:r>
-        <w:rPr>
-          <w:rFonts w:ascii="Times New Roman" w:hAnsi="Times New Roman"/>
-          <w:color w:val="000000"/>
-          <w:sz w:val="24"/>
-        </w:rPr>
-        <w:t>, Господи, Боже спасіння нашого, бо Ти все робиш для добра життя нашого, щоб ми завжди на Тебе споглядали, Спасителю й Доброчинцю душ наших. Бо Ти дав спокій нам у час минулої ночі й підвів нас, щоб ми поклонялися величному імені Твоєму. Тому молимо Тебе, Господи: Дай нам ласку й силу, щоб ми стали гідними співати Тобі розумно й молитися безупинно та в страсі і тремтінні над нашим спасінням працювали, при заступництві Христа Твого. Пом'яни, Господи, і тих, що вночі до Тебе кличуть. Вислухай їх і помилуй, і круши під ноги їх невидимих і войовничих ворогів. Бо Ти Цар миру і Спас душ наших, і Тобі славу возсилаємо: Отцю і Сину, і Святому Духові, нині і повсякчас, і на віки віків. Амінь.</w:t>
-      </w:r>
-    </w:p>
-    <w:p>
-      <w:pPr>
-        <w:spacing w:after="120"/>
-        <w:jc w:val="both"/>
-      </w:pPr>
-      <w:r>
-        <w:rPr>
-          <w:rFonts w:ascii="Times New Roman" w:hAnsi="Times New Roman"/>
-          <w:color w:val="FF0000"/>
-          <w:sz w:val="24"/>
-        </w:rPr>
-        <w:t>7.</w:t>
-      </w:r>
-      <w:r>
-        <w:rPr>
-          <w:rFonts w:ascii="Times New Roman" w:hAnsi="Times New Roman"/>
-          <w:color w:val="000000"/>
-          <w:sz w:val="24"/>
-        </w:rPr>
-        <w:t xml:space="preserve"> Боже й Отче Господа нашого Ісуса Христа! Ти підніс нас з постелі нашої і зібрав на годину молитви. Дай нам ласку відкрити уста наші і прийми наші подяки, що в наших силах, і навчи нас установ Твоїх. Бо молитися як слід не вміємо, якщо Ти, Господи, святим Твоїм Духом не навчиш нас. Тому молимося Тобі: Даруй і прости, якщо ми згрішили аж до теперішньої години </w:t>
-      </w:r>
-      <w:r>
-        <w:rPr>
-          <w:rFonts w:ascii="Times New Roman" w:hAnsi="Times New Roman"/>
-          <w:color w:val="000000"/>
-          <w:sz w:val="24"/>
-        </w:rPr>
-        <w:t>словом або ділом, або думкою, добровільно або недобровільно. Бо коли на провини будеш дивитися, Господи, Господи, то хто встоїться, бо в Тебе є прощення. Ти один святий, допоміжник сильний, захисник життя нашого, і Тебе ми завжди оспівуватимемо. Нехай буде сила Царства Твого завжди благословенна і вельми прославлювана: Отця, і Сина, і Святого Духа, нині і повсякчас, і на віки віків. Амінь.</w:t>
-      </w:r>
-    </w:p>
-    <w:p>
-      <w:pPr>
-        <w:spacing w:after="120"/>
-        <w:jc w:val="both"/>
-      </w:pPr>
-      <w:r>
-        <w:rPr>
-          <w:rFonts w:ascii="Times New Roman" w:hAnsi="Times New Roman"/>
-          <w:color w:val="FF0000"/>
-          <w:sz w:val="24"/>
-        </w:rPr>
-        <w:t xml:space="preserve">8. </w:t>
-      </w:r>
-      <w:r>
-        <w:rPr>
-          <w:rFonts w:ascii="Times New Roman" w:hAnsi="Times New Roman"/>
-          <w:color w:val="000000"/>
-          <w:sz w:val="24"/>
-        </w:rPr>
-        <w:t>Господи, Боже наш, що сонну неміч забрав від нас і покликав нас візванням святим, щоб і вночі підносити руки наші і прославляти Тебе за справедливі Твої присуди. Прийми благання наші, моління, визнавання, нічні служби і даруй нам, Боже, віру бездоганну, надію впевнену, любов нелицемірну. Благослови наші входи й виходи, вчинки, слова, діла й думки; і дай нам дочекатися початку дня, нам, що хвалять й оспівують, і благословлять добрість Твоєї несказанної сили, щоб було благословенне Твоє пресвяте ім'я і прославлене Твоє царство: Отця, і Сина, і Святого Духа, нині і повсякчас, і на віки віків. Амінь.</w:t>
-      </w:r>
-    </w:p>
-    <w:p>
-      <w:pPr>
-        <w:spacing w:after="120"/>
-        <w:jc w:val="both"/>
-      </w:pPr>
-      <w:r>
-        <w:rPr>
-          <w:rFonts w:ascii="Times New Roman" w:hAnsi="Times New Roman"/>
-          <w:color w:val="FF0000"/>
-          <w:sz w:val="24"/>
-        </w:rPr>
-        <w:t>9.</w:t>
-      </w:r>
-      <w:r>
-        <w:rPr>
-          <w:rFonts w:ascii="Times New Roman" w:hAnsi="Times New Roman"/>
-          <w:color w:val="000000"/>
-          <w:sz w:val="24"/>
-        </w:rPr>
-        <w:t xml:space="preserve"> Господи, Боже наш! Ти за покаяння дарував людям відпущення, нам же, як образ пізнання і визнання гріхів, показав покаяння і прощення пророка Давида. Тож, Владико, помилуй з великої милости Твоєї нас, що в чимало великих гріхів впали, і по багатстві ласк Твоїх очисти беззаконня наші, бо перед Тобою згрішили ми, Господи, що невідомі й таємні речі серця людського знаєш, і єдиний Ти маєш владу прощати гріхи. Серце ж чисте вчини в нас і Духом владичним утверди нас, і радість спасіння Твого яви нам. Не відкинь нас від лиця Твого, але дозволь, як благий і людинолюбний, аж до останнього нашого віддиху появляти Тобі жертву справедливости й приноси на святих Твоїх жертовниках, милістю і ласками і людинолюб'ям єдинородного Сина Твого, з яким Ти є благословенний з пресвятим, добрим і животворчим Твоїм Духом, нині й повсякчас, і на віки віків. Амінь.</w:t>
+        <w:t>владичним утверди нас, і радість спасіння Твого яви нам. Не відкинь нас від лиця Твого, але дозволь, як благий і людинолюбний, аж до останнього нашого віддиху появляти Тобі жертву справедливости й приноси на святих Твоїх жертовниках, милістю і ласками і людинолюб'ям єдинородного Сина Твого, з яким Ти є благословенний з пресвятим, добрим і животворчим Твоїм Духом, нині й повсякчас, і на віки віків. Амінь.</w:t>
       </w:r>
     </w:p>
     <w:p>
@@ -11232,7 +11143,15 @@
           <w:sz w:val="24"/>
           <w:u w:val="single"/>
         </w:rPr>
-        <w:t>[Владико, Боже святий і неосяжний, що казав із темряви світлові засіяти, що заспокоїв нас у нічному сні й підвів до величання і моління Твоєї доброти! Ти, що даєш себе умолити задля свого милосердя, прийми і нині нас, що поклоняємося Тобі й по силі благодаримо Тебе; і даруй нам те, чого просимо задля спасіння. Вчини нас синами світла і дня та спадкоємцями вічних Твоїх благ. Пом'яни, Господи, за багатством ласк Твоїх усіх людей, що є і моляться з нами, і всю братію нашу на землі й на морі, і на всякому місці володіння Твого, що потребують Твоєї любови й помочі. Усім вияви велику Твою милість, щоб спасенні, як душею так і тілом, завжди перебували й відважно славили чудне й благословенне ім'я Твоє.]</w:t>
+        <w:t xml:space="preserve">[Владико, Боже святий і неосяжний, що казав із темряви світлові засіяти, що заспокоїв нас у нічному сні й підвів до величання і моління Твоєї доброти! Ти, що даєш себе умолити задля </w:t>
+      </w:r>
+      <w:r>
+        <w:rPr>
+          <w:rFonts w:ascii="Times New Roman" w:hAnsi="Times New Roman"/>
+          <w:sz w:val="24"/>
+          <w:u w:val="single"/>
+        </w:rPr>
+        <w:t>свого милосердя, прийми і нині нас, що поклоняємося Тобі й по силі благодаримо Тебе; і даруй нам те, чого просимо задля спасіння. Вчини нас синами світла і дня та спадкоємцями вічних Твоїх благ. Пом'яни, Господи, за багатством ласк Твоїх усіх людей, що є і моляться з нами, і всю братію нашу на землі й на морі, і на всякому місці володіння Твого, що потребують Твоєї любови й помочі. Усім вияви велику Твою милість, щоб спасенні, як душею так і тілом, завжди перебували й відважно славили чудне й благословенне ім'я Твоє.]</w:t>
       </w:r>
     </w:p>
     <w:p>

</xml_diff>